<commit_message>
Nouveaux fichiers annotes + quelques corrections de code
</commit_message>
<xml_diff>
--- a/data/interviews/raw/Entretien 01 25.01.15 02_traitement_A.docx
+++ b/data/interviews/raw/Entretien 01 25.01.15 02_traitement_A.docx
@@ -141,7 +141,25 @@
           <w:sz w:val="24"/>
           <w:szCs w:val="24"/>
         </w:rPr>
-        <w:t>[Speaker 1] (0:08 - 0:09)</w:t>
+        <w:t>[</w:t>
+      </w:r>
+      <w:r>
+        <w:rPr>
+          <w:rFonts w:ascii="Calibri" w:eastAsia="Calibri" w:hAnsi="Calibri" w:cs="Calibri"/>
+          <w:color w:val="000000" w:themeColor="text1"/>
+          <w:sz w:val="24"/>
+          <w:szCs w:val="24"/>
+        </w:rPr>
+        <w:t>Interviewe</w:t>
+      </w:r>
+      <w:r>
+        <w:rPr>
+          <w:rFonts w:ascii="Calibri" w:eastAsia="Calibri" w:hAnsi="Calibri" w:cs="Calibri"/>
+          <w:color w:val="000000" w:themeColor="text1"/>
+          <w:sz w:val="24"/>
+          <w:szCs w:val="24"/>
+        </w:rPr>
+        <w:t>] (0:08 - 0:09)</w:t>
       </w:r>
     </w:p>
     <w:p>
@@ -258,7 +276,25 @@
           <w:sz w:val="24"/>
           <w:szCs w:val="24"/>
         </w:rPr>
-        <w:t xml:space="preserve">[Speaker 1] (0:15 - </w:t>
+        <w:t>[</w:t>
+      </w:r>
+      <w:r>
+        <w:rPr>
+          <w:rFonts w:ascii="Calibri" w:eastAsia="Calibri" w:hAnsi="Calibri" w:cs="Calibri"/>
+          <w:color w:val="000000" w:themeColor="text1"/>
+          <w:sz w:val="24"/>
+          <w:szCs w:val="24"/>
+        </w:rPr>
+        <w:t>Interviewe</w:t>
+      </w:r>
+      <w:r>
+        <w:rPr>
+          <w:rFonts w:ascii="Calibri" w:eastAsia="Calibri" w:hAnsi="Calibri" w:cs="Calibri"/>
+          <w:color w:val="000000" w:themeColor="text1"/>
+          <w:sz w:val="24"/>
+          <w:szCs w:val="24"/>
+        </w:rPr>
+        <w:t xml:space="preserve">] (0:15 - </w:t>
       </w:r>
       <w:r>
         <w:rPr>
@@ -719,7 +755,25 @@
           <w:sz w:val="24"/>
           <w:szCs w:val="24"/>
         </w:rPr>
-        <w:t>[Speaker 1] (2:45 - 2:59)</w:t>
+        <w:t>[</w:t>
+      </w:r>
+      <w:r>
+        <w:rPr>
+          <w:rFonts w:ascii="Calibri" w:eastAsia="Calibri" w:hAnsi="Calibri" w:cs="Calibri"/>
+          <w:color w:val="000000" w:themeColor="text1"/>
+          <w:sz w:val="24"/>
+          <w:szCs w:val="24"/>
+        </w:rPr>
+        <w:t>Interviewe</w:t>
+      </w:r>
+      <w:r>
+        <w:rPr>
+          <w:rFonts w:ascii="Calibri" w:eastAsia="Calibri" w:hAnsi="Calibri" w:cs="Calibri"/>
+          <w:color w:val="000000" w:themeColor="text1"/>
+          <w:sz w:val="24"/>
+          <w:szCs w:val="24"/>
+        </w:rPr>
+        <w:t>] (2:45 - 2:59)</w:t>
       </w:r>
     </w:p>
     <w:p>
@@ -837,7 +891,25 @@
           <w:sz w:val="24"/>
           <w:szCs w:val="24"/>
         </w:rPr>
-        <w:t>[Speaker 1] (3:01 - 3:03)</w:t>
+        <w:t>[</w:t>
+      </w:r>
+      <w:r>
+        <w:rPr>
+          <w:rFonts w:ascii="Calibri" w:eastAsia="Calibri" w:hAnsi="Calibri" w:cs="Calibri"/>
+          <w:color w:val="000000" w:themeColor="text1"/>
+          <w:sz w:val="24"/>
+          <w:szCs w:val="24"/>
+        </w:rPr>
+        <w:t>Interviewe</w:t>
+      </w:r>
+      <w:r>
+        <w:rPr>
+          <w:rFonts w:ascii="Calibri" w:eastAsia="Calibri" w:hAnsi="Calibri" w:cs="Calibri"/>
+          <w:color w:val="000000" w:themeColor="text1"/>
+          <w:sz w:val="24"/>
+          <w:szCs w:val="24"/>
+        </w:rPr>
+        <w:t>] (3:01 - 3:03)</w:t>
       </w:r>
     </w:p>
     <w:p>
@@ -954,7 +1026,25 @@
           <w:sz w:val="24"/>
           <w:szCs w:val="24"/>
         </w:rPr>
-        <w:t>[Speaker 1] (3:21 - 3:47)</w:t>
+        <w:t>[</w:t>
+      </w:r>
+      <w:r>
+        <w:rPr>
+          <w:rFonts w:ascii="Calibri" w:eastAsia="Calibri" w:hAnsi="Calibri" w:cs="Calibri"/>
+          <w:color w:val="000000" w:themeColor="text1"/>
+          <w:sz w:val="24"/>
+          <w:szCs w:val="24"/>
+        </w:rPr>
+        <w:t>Interviewe</w:t>
+      </w:r>
+      <w:r>
+        <w:rPr>
+          <w:rFonts w:ascii="Calibri" w:eastAsia="Calibri" w:hAnsi="Calibri" w:cs="Calibri"/>
+          <w:color w:val="000000" w:themeColor="text1"/>
+          <w:sz w:val="24"/>
+          <w:szCs w:val="24"/>
+        </w:rPr>
+        <w:t>] (3:21 - 3:47)</w:t>
       </w:r>
     </w:p>
     <w:p>
@@ -1134,7 +1224,25 @@
           <w:sz w:val="24"/>
           <w:szCs w:val="24"/>
         </w:rPr>
-        <w:t>[Speaker 1] (3:58 - 4:01)</w:t>
+        <w:t>[</w:t>
+      </w:r>
+      <w:r>
+        <w:rPr>
+          <w:rFonts w:ascii="Calibri" w:eastAsia="Calibri" w:hAnsi="Calibri" w:cs="Calibri"/>
+          <w:color w:val="000000" w:themeColor="text1"/>
+          <w:sz w:val="24"/>
+          <w:szCs w:val="24"/>
+        </w:rPr>
+        <w:t>Interviewe</w:t>
+      </w:r>
+      <w:r>
+        <w:rPr>
+          <w:rFonts w:ascii="Calibri" w:eastAsia="Calibri" w:hAnsi="Calibri" w:cs="Calibri"/>
+          <w:color w:val="000000" w:themeColor="text1"/>
+          <w:sz w:val="24"/>
+          <w:szCs w:val="24"/>
+        </w:rPr>
+        <w:t>] (3:58 - 4:01)</w:t>
       </w:r>
     </w:p>
     <w:p>
@@ -1230,7 +1338,25 @@
           <w:sz w:val="24"/>
           <w:szCs w:val="24"/>
         </w:rPr>
-        <w:t>[Speaker 1] (4:03 - 4:04)</w:t>
+        <w:t>[</w:t>
+      </w:r>
+      <w:r>
+        <w:rPr>
+          <w:rFonts w:ascii="Calibri" w:eastAsia="Calibri" w:hAnsi="Calibri" w:cs="Calibri"/>
+          <w:color w:val="000000" w:themeColor="text1"/>
+          <w:sz w:val="24"/>
+          <w:szCs w:val="24"/>
+        </w:rPr>
+        <w:t>Interviewe</w:t>
+      </w:r>
+      <w:r>
+        <w:rPr>
+          <w:rFonts w:ascii="Calibri" w:eastAsia="Calibri" w:hAnsi="Calibri" w:cs="Calibri"/>
+          <w:color w:val="000000" w:themeColor="text1"/>
+          <w:sz w:val="24"/>
+          <w:szCs w:val="24"/>
+        </w:rPr>
+        <w:t>] (4:03 - 4:04)</w:t>
       </w:r>
     </w:p>
     <w:p>
@@ -1326,7 +1452,25 @@
           <w:sz w:val="24"/>
           <w:szCs w:val="24"/>
         </w:rPr>
-        <w:t>[Speaker 1] (4:06 - 4:43)</w:t>
+        <w:t>[</w:t>
+      </w:r>
+      <w:r>
+        <w:rPr>
+          <w:rFonts w:ascii="Calibri" w:eastAsia="Calibri" w:hAnsi="Calibri" w:cs="Calibri"/>
+          <w:color w:val="000000" w:themeColor="text1"/>
+          <w:sz w:val="24"/>
+          <w:szCs w:val="24"/>
+        </w:rPr>
+        <w:t>Interviewe</w:t>
+      </w:r>
+      <w:r>
+        <w:rPr>
+          <w:rFonts w:ascii="Calibri" w:eastAsia="Calibri" w:hAnsi="Calibri" w:cs="Calibri"/>
+          <w:color w:val="000000" w:themeColor="text1"/>
+          <w:sz w:val="24"/>
+          <w:szCs w:val="24"/>
+        </w:rPr>
+        <w:t>] (4:06 - 4:43)</w:t>
       </w:r>
     </w:p>
     <w:p>
@@ -1468,7 +1612,25 @@
           <w:sz w:val="24"/>
           <w:szCs w:val="24"/>
         </w:rPr>
-        <w:t>[Speaker 1] (4:46 - 4:46)</w:t>
+        <w:t>[</w:t>
+      </w:r>
+      <w:r>
+        <w:rPr>
+          <w:rFonts w:ascii="Calibri" w:eastAsia="Calibri" w:hAnsi="Calibri" w:cs="Calibri"/>
+          <w:color w:val="000000" w:themeColor="text1"/>
+          <w:sz w:val="24"/>
+          <w:szCs w:val="24"/>
+        </w:rPr>
+        <w:t>Interviewe</w:t>
+      </w:r>
+      <w:r>
+        <w:rPr>
+          <w:rFonts w:ascii="Calibri" w:eastAsia="Calibri" w:hAnsi="Calibri" w:cs="Calibri"/>
+          <w:color w:val="000000" w:themeColor="text1"/>
+          <w:sz w:val="24"/>
+          <w:szCs w:val="24"/>
+        </w:rPr>
+        <w:t>] (4:46 - 4:46)</w:t>
       </w:r>
     </w:p>
     <w:p>
@@ -1585,7 +1747,25 @@
           <w:sz w:val="24"/>
           <w:szCs w:val="24"/>
         </w:rPr>
-        <w:t>[Speaker 1] (4:53 - 5:01)</w:t>
+        <w:t>[</w:t>
+      </w:r>
+      <w:r>
+        <w:rPr>
+          <w:rFonts w:ascii="Calibri" w:eastAsia="Calibri" w:hAnsi="Calibri" w:cs="Calibri"/>
+          <w:color w:val="000000" w:themeColor="text1"/>
+          <w:sz w:val="24"/>
+          <w:szCs w:val="24"/>
+        </w:rPr>
+        <w:t>Interviewe</w:t>
+      </w:r>
+      <w:r>
+        <w:rPr>
+          <w:rFonts w:ascii="Calibri" w:eastAsia="Calibri" w:hAnsi="Calibri" w:cs="Calibri"/>
+          <w:color w:val="000000" w:themeColor="text1"/>
+          <w:sz w:val="24"/>
+          <w:szCs w:val="24"/>
+        </w:rPr>
+        <w:t>] (4:53 - 5:01)</w:t>
       </w:r>
     </w:p>
     <w:p>
@@ -1681,7 +1861,25 @@
           <w:sz w:val="24"/>
           <w:szCs w:val="24"/>
         </w:rPr>
-        <w:t>[Speaker 1] (5:08 - 5:08)</w:t>
+        <w:t>[</w:t>
+      </w:r>
+      <w:r>
+        <w:rPr>
+          <w:rFonts w:ascii="Calibri" w:eastAsia="Calibri" w:hAnsi="Calibri" w:cs="Calibri"/>
+          <w:color w:val="000000" w:themeColor="text1"/>
+          <w:sz w:val="24"/>
+          <w:szCs w:val="24"/>
+        </w:rPr>
+        <w:t>Interviewe</w:t>
+      </w:r>
+      <w:r>
+        <w:rPr>
+          <w:rFonts w:ascii="Calibri" w:eastAsia="Calibri" w:hAnsi="Calibri" w:cs="Calibri"/>
+          <w:color w:val="000000" w:themeColor="text1"/>
+          <w:sz w:val="24"/>
+          <w:szCs w:val="24"/>
+        </w:rPr>
+        <w:t>] (5:08 - 5:08)</w:t>
       </w:r>
     </w:p>
     <w:p>
@@ -1777,7 +1975,25 @@
           <w:sz w:val="24"/>
           <w:szCs w:val="24"/>
         </w:rPr>
-        <w:t>[Speaker 1] (5:21 - 5:51)</w:t>
+        <w:t>[</w:t>
+      </w:r>
+      <w:r>
+        <w:rPr>
+          <w:rFonts w:ascii="Calibri" w:eastAsia="Calibri" w:hAnsi="Calibri" w:cs="Calibri"/>
+          <w:color w:val="000000" w:themeColor="text1"/>
+          <w:sz w:val="24"/>
+          <w:szCs w:val="24"/>
+        </w:rPr>
+        <w:t>Interviewe</w:t>
+      </w:r>
+      <w:r>
+        <w:rPr>
+          <w:rFonts w:ascii="Calibri" w:eastAsia="Calibri" w:hAnsi="Calibri" w:cs="Calibri"/>
+          <w:color w:val="000000" w:themeColor="text1"/>
+          <w:sz w:val="24"/>
+          <w:szCs w:val="24"/>
+        </w:rPr>
+        <w:t>] (5:21 - 5:51)</w:t>
       </w:r>
     </w:p>
     <w:p>
@@ -1914,7 +2130,25 @@
           <w:sz w:val="24"/>
           <w:szCs w:val="24"/>
         </w:rPr>
-        <w:t>[Speaker 1] (6:07 - 6:09)</w:t>
+        <w:t>[</w:t>
+      </w:r>
+      <w:r>
+        <w:rPr>
+          <w:rFonts w:ascii="Calibri" w:eastAsia="Calibri" w:hAnsi="Calibri" w:cs="Calibri"/>
+          <w:color w:val="000000" w:themeColor="text1"/>
+          <w:sz w:val="24"/>
+          <w:szCs w:val="24"/>
+        </w:rPr>
+        <w:t>Interviewe</w:t>
+      </w:r>
+      <w:r>
+        <w:rPr>
+          <w:rFonts w:ascii="Calibri" w:eastAsia="Calibri" w:hAnsi="Calibri" w:cs="Calibri"/>
+          <w:color w:val="000000" w:themeColor="text1"/>
+          <w:sz w:val="24"/>
+          <w:szCs w:val="24"/>
+        </w:rPr>
+        <w:t>] (6:07 - 6:09)</w:t>
       </w:r>
     </w:p>
     <w:p>
@@ -2010,7 +2244,25 @@
           <w:sz w:val="24"/>
           <w:szCs w:val="24"/>
         </w:rPr>
-        <w:t>[Speaker 1] (6:19 - 6:42)</w:t>
+        <w:t>[</w:t>
+      </w:r>
+      <w:r>
+        <w:rPr>
+          <w:rFonts w:ascii="Calibri" w:eastAsia="Calibri" w:hAnsi="Calibri" w:cs="Calibri"/>
+          <w:color w:val="000000" w:themeColor="text1"/>
+          <w:sz w:val="24"/>
+          <w:szCs w:val="24"/>
+        </w:rPr>
+        <w:t>Interviewe</w:t>
+      </w:r>
+      <w:r>
+        <w:rPr>
+          <w:rFonts w:ascii="Calibri" w:eastAsia="Calibri" w:hAnsi="Calibri" w:cs="Calibri"/>
+          <w:color w:val="000000" w:themeColor="text1"/>
+          <w:sz w:val="24"/>
+          <w:szCs w:val="24"/>
+        </w:rPr>
+        <w:t>] (6:19 - 6:42)</w:t>
       </w:r>
     </w:p>
     <w:p>
@@ -2129,7 +2381,25 @@
           <w:sz w:val="24"/>
           <w:szCs w:val="24"/>
         </w:rPr>
-        <w:t>[Speaker 1] (6:51 - 6:53)</w:t>
+        <w:t>[</w:t>
+      </w:r>
+      <w:r>
+        <w:rPr>
+          <w:rFonts w:ascii="Calibri" w:eastAsia="Calibri" w:hAnsi="Calibri" w:cs="Calibri"/>
+          <w:color w:val="000000" w:themeColor="text1"/>
+          <w:sz w:val="24"/>
+          <w:szCs w:val="24"/>
+        </w:rPr>
+        <w:t>Interviewe</w:t>
+      </w:r>
+      <w:r>
+        <w:rPr>
+          <w:rFonts w:ascii="Calibri" w:eastAsia="Calibri" w:hAnsi="Calibri" w:cs="Calibri"/>
+          <w:color w:val="000000" w:themeColor="text1"/>
+          <w:sz w:val="24"/>
+          <w:szCs w:val="24"/>
+        </w:rPr>
+        <w:t>] (6:51 - 6:53)</w:t>
       </w:r>
     </w:p>
     <w:p>
@@ -2261,7 +2531,25 @@
           <w:sz w:val="24"/>
           <w:szCs w:val="24"/>
         </w:rPr>
-        <w:t>[Speaker 1] (7:00 - 7:18)</w:t>
+        <w:t>[</w:t>
+      </w:r>
+      <w:r>
+        <w:rPr>
+          <w:rFonts w:ascii="Calibri" w:eastAsia="Calibri" w:hAnsi="Calibri" w:cs="Calibri"/>
+          <w:color w:val="000000" w:themeColor="text1"/>
+          <w:sz w:val="24"/>
+          <w:szCs w:val="24"/>
+        </w:rPr>
+        <w:t>Interviewe</w:t>
+      </w:r>
+      <w:r>
+        <w:rPr>
+          <w:rFonts w:ascii="Calibri" w:eastAsia="Calibri" w:hAnsi="Calibri" w:cs="Calibri"/>
+          <w:color w:val="000000" w:themeColor="text1"/>
+          <w:sz w:val="24"/>
+          <w:szCs w:val="24"/>
+        </w:rPr>
+        <w:t>] (7:00 - 7:18)</w:t>
       </w:r>
     </w:p>
     <w:p>
@@ -2329,7 +2617,25 @@
           <w:sz w:val="24"/>
           <w:szCs w:val="24"/>
         </w:rPr>
-        <w:t>[Speaker 1] (7:18 - 7:18)</w:t>
+        <w:t>[</w:t>
+      </w:r>
+      <w:r>
+        <w:rPr>
+          <w:rFonts w:ascii="Calibri" w:eastAsia="Calibri" w:hAnsi="Calibri" w:cs="Calibri"/>
+          <w:color w:val="000000" w:themeColor="text1"/>
+          <w:sz w:val="24"/>
+          <w:szCs w:val="24"/>
+        </w:rPr>
+        <w:t>Interviewe</w:t>
+      </w:r>
+      <w:r>
+        <w:rPr>
+          <w:rFonts w:ascii="Calibri" w:eastAsia="Calibri" w:hAnsi="Calibri" w:cs="Calibri"/>
+          <w:color w:val="000000" w:themeColor="text1"/>
+          <w:sz w:val="24"/>
+          <w:szCs w:val="24"/>
+        </w:rPr>
+        <w:t>] (7:18 - 7:18)</w:t>
       </w:r>
     </w:p>
     <w:p>
@@ -2431,7 +2737,25 @@
           <w:sz w:val="24"/>
           <w:szCs w:val="24"/>
         </w:rPr>
-        <w:t>[Speaker 1] (7:24 - 7:24)</w:t>
+        <w:t>[</w:t>
+      </w:r>
+      <w:r>
+        <w:rPr>
+          <w:rFonts w:ascii="Calibri" w:eastAsia="Calibri" w:hAnsi="Calibri" w:cs="Calibri"/>
+          <w:color w:val="000000" w:themeColor="text1"/>
+          <w:sz w:val="24"/>
+          <w:szCs w:val="24"/>
+        </w:rPr>
+        <w:t>Interviewe</w:t>
+      </w:r>
+      <w:r>
+        <w:rPr>
+          <w:rFonts w:ascii="Calibri" w:eastAsia="Calibri" w:hAnsi="Calibri" w:cs="Calibri"/>
+          <w:color w:val="000000" w:themeColor="text1"/>
+          <w:sz w:val="24"/>
+          <w:szCs w:val="24"/>
+        </w:rPr>
+        <w:t>] (7:24 - 7:24)</w:t>
       </w:r>
     </w:p>
     <w:p>
@@ -2470,7 +2794,25 @@
           <w:sz w:val="24"/>
           <w:szCs w:val="24"/>
         </w:rPr>
-        <w:t>[Speaker 1] (7:25 - 7:27)</w:t>
+        <w:t>[</w:t>
+      </w:r>
+      <w:r>
+        <w:rPr>
+          <w:rFonts w:ascii="Calibri" w:eastAsia="Calibri" w:hAnsi="Calibri" w:cs="Calibri"/>
+          <w:color w:val="000000" w:themeColor="text1"/>
+          <w:sz w:val="24"/>
+          <w:szCs w:val="24"/>
+        </w:rPr>
+        <w:t>Interviewe</w:t>
+      </w:r>
+      <w:r>
+        <w:rPr>
+          <w:rFonts w:ascii="Calibri" w:eastAsia="Calibri" w:hAnsi="Calibri" w:cs="Calibri"/>
+          <w:color w:val="000000" w:themeColor="text1"/>
+          <w:sz w:val="24"/>
+          <w:szCs w:val="24"/>
+        </w:rPr>
+        <w:t>] (7:25 - 7:27)</w:t>
       </w:r>
     </w:p>
     <w:p>
@@ -2588,7 +2930,25 @@
           <w:sz w:val="24"/>
           <w:szCs w:val="24"/>
         </w:rPr>
-        <w:t>[Speaker 1] (7:54 - 8:51)</w:t>
+        <w:t>[</w:t>
+      </w:r>
+      <w:r>
+        <w:rPr>
+          <w:rFonts w:ascii="Calibri" w:eastAsia="Calibri" w:hAnsi="Calibri" w:cs="Calibri"/>
+          <w:color w:val="000000" w:themeColor="text1"/>
+          <w:sz w:val="24"/>
+          <w:szCs w:val="24"/>
+        </w:rPr>
+        <w:t>Interviewe</w:t>
+      </w:r>
+      <w:r>
+        <w:rPr>
+          <w:rFonts w:ascii="Calibri" w:eastAsia="Calibri" w:hAnsi="Calibri" w:cs="Calibri"/>
+          <w:color w:val="000000" w:themeColor="text1"/>
+          <w:sz w:val="24"/>
+          <w:szCs w:val="24"/>
+        </w:rPr>
+        <w:t>] (7:54 - 8:51)</w:t>
       </w:r>
     </w:p>
     <w:p>
@@ -2746,7 +3106,25 @@
           <w:sz w:val="24"/>
           <w:szCs w:val="24"/>
         </w:rPr>
-        <w:t>[Speaker 1] (8:56 - 9:01)</w:t>
+        <w:t>[</w:t>
+      </w:r>
+      <w:r>
+        <w:rPr>
+          <w:rFonts w:ascii="Calibri" w:eastAsia="Calibri" w:hAnsi="Calibri" w:cs="Calibri"/>
+          <w:color w:val="000000" w:themeColor="text1"/>
+          <w:sz w:val="24"/>
+          <w:szCs w:val="24"/>
+        </w:rPr>
+        <w:t>Interviewe</w:t>
+      </w:r>
+      <w:r>
+        <w:rPr>
+          <w:rFonts w:ascii="Calibri" w:eastAsia="Calibri" w:hAnsi="Calibri" w:cs="Calibri"/>
+          <w:color w:val="000000" w:themeColor="text1"/>
+          <w:sz w:val="24"/>
+          <w:szCs w:val="24"/>
+        </w:rPr>
+        <w:t>] (8:56 - 9:01)</w:t>
       </w:r>
     </w:p>
     <w:p>
@@ -2842,7 +3220,25 @@
           <w:sz w:val="24"/>
           <w:szCs w:val="24"/>
         </w:rPr>
-        <w:t>[Speaker 1] (9:08 - 9:42)</w:t>
+        <w:t>[</w:t>
+      </w:r>
+      <w:r>
+        <w:rPr>
+          <w:rFonts w:ascii="Calibri" w:eastAsia="Calibri" w:hAnsi="Calibri" w:cs="Calibri"/>
+          <w:color w:val="000000" w:themeColor="text1"/>
+          <w:sz w:val="24"/>
+          <w:szCs w:val="24"/>
+        </w:rPr>
+        <w:t>Interviewe</w:t>
+      </w:r>
+      <w:r>
+        <w:rPr>
+          <w:rFonts w:ascii="Calibri" w:eastAsia="Calibri" w:hAnsi="Calibri" w:cs="Calibri"/>
+          <w:color w:val="000000" w:themeColor="text1"/>
+          <w:sz w:val="24"/>
+          <w:szCs w:val="24"/>
+        </w:rPr>
+        <w:t>] (9:08 - 9:42)</w:t>
       </w:r>
     </w:p>
     <w:p>
@@ -2996,7 +3392,25 @@
           <w:sz w:val="24"/>
           <w:szCs w:val="24"/>
         </w:rPr>
-        <w:t>[Speaker 1] (9:46 - 9:47)</w:t>
+        <w:t>[</w:t>
+      </w:r>
+      <w:r>
+        <w:rPr>
+          <w:rFonts w:ascii="Calibri" w:eastAsia="Calibri" w:hAnsi="Calibri" w:cs="Calibri"/>
+          <w:color w:val="000000" w:themeColor="text1"/>
+          <w:sz w:val="24"/>
+          <w:szCs w:val="24"/>
+        </w:rPr>
+        <w:t>Interviewe</w:t>
+      </w:r>
+      <w:r>
+        <w:rPr>
+          <w:rFonts w:ascii="Calibri" w:eastAsia="Calibri" w:hAnsi="Calibri" w:cs="Calibri"/>
+          <w:color w:val="000000" w:themeColor="text1"/>
+          <w:sz w:val="24"/>
+          <w:szCs w:val="24"/>
+        </w:rPr>
+        <w:t>] (9:46 - 9:47)</w:t>
       </w:r>
     </w:p>
     <w:p>
@@ -3135,7 +3549,7 @@
     <w:rPrDefault>
       <w:rPr>
         <w:rFonts w:ascii="Times New Roman" w:eastAsia="Times New Roman" w:hAnsi="Times New Roman" w:cs="Times New Roman"/>
-        <w:lang w:val="en-FR" w:eastAsia="en-GB" w:bidi="ar-SA"/>
+        <w:lang w:eastAsia="en-GB" w:bidi="ar-SA"/>
       </w:rPr>
     </w:rPrDefault>
     <w:pPrDefault/>
@@ -3522,7 +3936,7 @@
     <w:name w:val="Normal"/>
     <w:qFormat/>
   </w:style>
-  <w:style w:type="paragraph" w:styleId="Heading1">
+  <w:style w:type="paragraph" w:styleId="Titre1">
     <w:name w:val="heading 1"/>
     <w:uiPriority w:val="9"/>
     <w:qFormat/>
@@ -3535,7 +3949,7 @@
       <w:szCs w:val="32"/>
     </w:rPr>
   </w:style>
-  <w:style w:type="paragraph" w:styleId="Heading2">
+  <w:style w:type="paragraph" w:styleId="Titre2">
     <w:name w:val="heading 2"/>
     <w:uiPriority w:val="9"/>
     <w:semiHidden/>
@@ -3550,7 +3964,7 @@
       <w:szCs w:val="26"/>
     </w:rPr>
   </w:style>
-  <w:style w:type="paragraph" w:styleId="Heading3">
+  <w:style w:type="paragraph" w:styleId="Titre3">
     <w:name w:val="heading 3"/>
     <w:uiPriority w:val="9"/>
     <w:semiHidden/>
@@ -3565,7 +3979,7 @@
       <w:szCs w:val="24"/>
     </w:rPr>
   </w:style>
-  <w:style w:type="paragraph" w:styleId="Heading4">
+  <w:style w:type="paragraph" w:styleId="Titre4">
     <w:name w:val="heading 4"/>
     <w:uiPriority w:val="9"/>
     <w:semiHidden/>
@@ -3580,7 +3994,7 @@
       <w:color w:val="2E74B5"/>
     </w:rPr>
   </w:style>
-  <w:style w:type="paragraph" w:styleId="Heading5">
+  <w:style w:type="paragraph" w:styleId="Titre5">
     <w:name w:val="heading 5"/>
     <w:uiPriority w:val="9"/>
     <w:semiHidden/>
@@ -3593,7 +4007,7 @@
       <w:color w:val="2E74B5"/>
     </w:rPr>
   </w:style>
-  <w:style w:type="paragraph" w:styleId="Heading6">
+  <w:style w:type="paragraph" w:styleId="Titre6">
     <w:name w:val="heading 6"/>
     <w:uiPriority w:val="9"/>
     <w:semiHidden/>
@@ -3606,13 +4020,13 @@
       <w:color w:val="1F4D78"/>
     </w:rPr>
   </w:style>
-  <w:style w:type="character" w:default="1" w:styleId="DefaultParagraphFont">
+  <w:style w:type="character" w:default="1" w:styleId="Policepardfaut">
     <w:name w:val="Default Paragraph Font"/>
     <w:uiPriority w:val="1"/>
     <w:semiHidden/>
     <w:unhideWhenUsed/>
   </w:style>
-  <w:style w:type="table" w:default="1" w:styleId="TableNormal">
+  <w:style w:type="table" w:default="1" w:styleId="TableauNormal">
     <w:name w:val="Normal Table"/>
     <w:uiPriority w:val="99"/>
     <w:semiHidden/>
@@ -3627,13 +4041,13 @@
       </w:tblCellMar>
     </w:tblPr>
   </w:style>
-  <w:style w:type="numbering" w:default="1" w:styleId="NoList">
+  <w:style w:type="numbering" w:default="1" w:styleId="Aucuneliste">
     <w:name w:val="No List"/>
     <w:uiPriority w:val="99"/>
     <w:semiHidden/>
     <w:unhideWhenUsed/>
   </w:style>
-  <w:style w:type="paragraph" w:styleId="Title">
+  <w:style w:type="paragraph" w:styleId="Titre">
     <w:name w:val="Title"/>
     <w:uiPriority w:val="10"/>
     <w:qFormat/>
@@ -3650,11 +4064,11 @@
       <w:bCs/>
     </w:rPr>
   </w:style>
-  <w:style w:type="paragraph" w:styleId="ListParagraph">
+  <w:style w:type="paragraph" w:styleId="Paragraphedeliste">
     <w:name w:val="List Paragraph"/>
     <w:qFormat/>
   </w:style>
-  <w:style w:type="character" w:styleId="Hyperlink">
+  <w:style w:type="character" w:styleId="Lienhypertexte">
     <w:name w:val="Hyperlink"/>
     <w:uiPriority w:val="99"/>
     <w:unhideWhenUsed/>
@@ -3663,7 +4077,7 @@
       <w:u w:val="single"/>
     </w:rPr>
   </w:style>
-  <w:style w:type="character" w:styleId="FootnoteReference">
+  <w:style w:type="character" w:styleId="Appelnotedebasdep">
     <w:name w:val="footnote reference"/>
     <w:uiPriority w:val="99"/>
     <w:semiHidden/>
@@ -3672,16 +4086,16 @@
       <w:vertAlign w:val="superscript"/>
     </w:rPr>
   </w:style>
-  <w:style w:type="paragraph" w:styleId="FootnoteText">
+  <w:style w:type="paragraph" w:styleId="Notedebasdepage">
     <w:name w:val="footnote text"/>
-    <w:link w:val="FootnoteTextChar"/>
+    <w:link w:val="NotedebasdepageCar"/>
     <w:uiPriority w:val="99"/>
     <w:semiHidden/>
     <w:unhideWhenUsed/>
   </w:style>
-  <w:style w:type="character" w:customStyle="1" w:styleId="FootnoteTextChar">
-    <w:name w:val="Footnote Text Char"/>
-    <w:link w:val="FootnoteText"/>
+  <w:style w:type="character" w:customStyle="1" w:styleId="NotedebasdepageCar">
+    <w:name w:val="Note de bas de page Car"/>
+    <w:link w:val="Notedebasdepage"/>
     <w:uiPriority w:val="99"/>
     <w:semiHidden/>
     <w:unhideWhenUsed/>

</xml_diff>